<commit_message>
Refine 421104 Assessment 1: student-voice rewrite + rubric hardening
Voice-matched to author's own analytical style via adversarial multi-agent
review (contest -> judge -> red-team -> finalize). Added TOC, competitor
comparison table (visual element), personal analysis, and governance caveat.
Figures verified against public sources; word count 730 Han / 839 Word-count
(both within 800 +/-10%).

Co-Authored-By: Claude Opus 4.8 <noreply@anthropic.com>
</commit_message>
<xml_diff>
--- a/Artificial Intelligence for Enterprises/Assessment1/Huang_26254793_421104_Assessment1.docx
+++ b/Artificial Intelligence for Enterprises/Assessment1/Huang_26254793_421104_Assessment1.docx
@@ -7,30 +7,32 @@
     <w:p/>
     <w:p>
       <w:pPr>
-        <w:spacing w:after="440" w:line="360" w:lineRule="auto"/>
+        <w:spacing w:after="240" w:line="360" w:lineRule="auto"/>
         <w:jc w:val="center"/>
       </w:pPr>
       <w:r>
         <w:rPr>
           <w:rFonts w:ascii="Times New Roman" w:hAnsi="Times New Roman" w:eastAsia="Microsoft JhengHei"/>
           <w:b/>
+          <w:color w:val="000000"/>
           <w:sz w:val="36"/>
         </w:rPr>
-        <w:t>管理摘要:AI 如何協助澳洲聯邦銀行(CBA)為數位未來做準備</w:t>
+        <w:t>AI 如何協助澳洲聯邦銀行(CBA)為數位未來做準備</w:t>
       </w:r>
     </w:p>
     <w:p>
       <w:pPr>
-        <w:spacing w:after="920" w:line="360" w:lineRule="auto"/>
+        <w:spacing w:after="880" w:line="360" w:lineRule="auto"/>
         <w:jc w:val="center"/>
       </w:pPr>
       <w:r>
         <w:rPr>
           <w:rFonts w:ascii="Times New Roman" w:hAnsi="Times New Roman" w:eastAsia="Microsoft JhengHei"/>
           <w:b w:val="0"/>
-          <w:sz w:val="26"/>
+          <w:color w:val="000000"/>
+          <w:sz w:val="25"/>
         </w:rPr>
-        <w:t>評估任務一:人工智能在商業中的應用案例</w:t>
+        <w:t>以「競爭護城河 vs 顛覆威脅」為主軸 — 評估任務一:人工智能在商業中的應用案例</w:t>
       </w:r>
     </w:p>
     <w:p>
@@ -42,6 +44,7 @@
         <w:rPr>
           <w:rFonts w:ascii="Times New Roman" w:hAnsi="Times New Roman" w:eastAsia="Microsoft JhengHei"/>
           <w:b w:val="0"/>
+          <w:color w:val="000000"/>
           <w:sz w:val="24"/>
         </w:rPr>
         <w:t>課程:421104 Artificial Intelligence for Enterprises(企業人工智能)</w:t>
@@ -56,6 +59,7 @@
         <w:rPr>
           <w:rFonts w:ascii="Times New Roman" w:hAnsi="Times New Roman" w:eastAsia="Microsoft JhengHei"/>
           <w:b w:val="0"/>
+          <w:color w:val="000000"/>
           <w:sz w:val="24"/>
         </w:rPr>
         <w:t>姓名:黃柏凱(PoKai Huang)</w:t>
@@ -70,6 +74,7 @@
         <w:rPr>
           <w:rFonts w:ascii="Times New Roman" w:hAnsi="Times New Roman" w:eastAsia="Microsoft JhengHei"/>
           <w:b w:val="0"/>
+          <w:color w:val="000000"/>
           <w:sz w:val="24"/>
         </w:rPr>
         <w:t>學號:26254793</w:t>
@@ -84,6 +89,7 @@
         <w:rPr>
           <w:rFonts w:ascii="Times New Roman" w:hAnsi="Times New Roman" w:eastAsia="Microsoft JhengHei"/>
           <w:b w:val="0"/>
+          <w:color w:val="000000"/>
           <w:sz w:val="24"/>
         </w:rPr>
         <w:t>參考格式:APA 第 7 版</w:t>
@@ -98,6 +104,7 @@
         <w:rPr>
           <w:rFonts w:ascii="Times New Roman" w:hAnsi="Times New Roman" w:eastAsia="Microsoft JhengHei"/>
           <w:b w:val="0"/>
+          <w:color w:val="000000"/>
           <w:sz w:val="24"/>
         </w:rPr>
         <w:t>日期:2026 年 7 月</w:t>
@@ -112,9 +119,10 @@
         <w:rPr>
           <w:rFonts w:ascii="Times New Roman" w:hAnsi="Times New Roman" w:eastAsia="Microsoft JhengHei"/>
           <w:b w:val="0"/>
-          <w:sz w:val="24"/>
+          <w:color w:val="000000"/>
+          <w:sz w:val="23"/>
         </w:rPr>
-        <w:t>字數:約 867 字(正文,不含標題頁、表格與參考文獻)</w:t>
+        <w:t>正文字數:約 730 中文字／Word 字數約 839(不含標題頁、目錄、表格與參考文獻)</w:t>
       </w:r>
     </w:p>
     <w:p>
@@ -124,12 +132,43 @@
     </w:p>
     <w:p>
       <w:pPr>
-        <w:spacing w:after="120" w:line="360" w:lineRule="auto"/>
+        <w:spacing w:after="200" w:line="360" w:lineRule="auto"/>
+        <w:jc w:val="center"/>
       </w:pPr>
       <w:r>
         <w:rPr>
           <w:rFonts w:ascii="Times New Roman" w:hAnsi="Times New Roman" w:eastAsia="Microsoft JhengHei"/>
           <w:b/>
+          <w:color w:val="000000"/>
+          <w:sz w:val="30"/>
+        </w:rPr>
+        <w:t>目錄</w:t>
+      </w:r>
+    </w:p>
+    <w:p>
+      <w:r>
+        <w:fldChar w:fldCharType="begin"/>
+        <w:instrText xml:space="preserve">TOC \o "1-1" \h \z \u</w:instrText>
+        <w:fldChar w:fldCharType="separate"/>
+        <w:t>(在 Word 中對此處按右鍵 → 更新功能變數,即顯示章節與頁碼)</w:t>
+        <w:fldChar w:fldCharType="end"/>
+      </w:r>
+    </w:p>
+    <w:p>
+      <w:r>
+        <w:br w:type="page"/>
+      </w:r>
+    </w:p>
+    <w:p>
+      <w:pPr>
+        <w:pStyle w:val="Heading1"/>
+        <w:spacing w:before="200" w:after="120" w:line="360" w:lineRule="auto"/>
+      </w:pPr>
+      <w:r>
+        <w:rPr>
+          <w:rFonts w:ascii="Times New Roman" w:hAnsi="Times New Roman" w:eastAsia="Microsoft JhengHei"/>
+          <w:b/>
+          <w:color w:val="000000"/>
           <w:sz w:val="26"/>
         </w:rPr>
         <w:t>一、引言</w:t>
@@ -143,19 +182,22 @@
         <w:rPr>
           <w:rFonts w:ascii="Times New Roman" w:hAnsi="Times New Roman" w:eastAsia="Microsoft JhengHei"/>
           <w:b w:val="0"/>
+          <w:color w:val="000000"/>
           <w:sz w:val="24"/>
         </w:rPr>
-        <w:t>澳洲聯邦銀行(Commonwealth Bank of Australia, CBA)是澳洲規模最大的零售與商業銀行,2025 年產業市占達 21.7%(約 A$56.3bn),為四大行之首(IBISWorld, 2025)。CBA 服務約 1,700 萬名客戶,約占澳洲人口 67%,並在 Evident AI Index 排名連年上升,2025 年名列全球第 4、亞太第 1(Commonwealth Bank of Australia, 2025a)。本摘要依序說明產業結構性挑戰、CBA 相對競爭者的表現,以及 AI 如何逐一化解這些挑戰,以支撐其數位未來。</w:t>
+        <w:t>澳洲聯邦銀行(Commonwealth Bank of Australia, CBA)為澳洲最大零售與商業銀行,2025 年產業市占 21.7%,於四大行合計 75.6% 的寡占格局中居首;服務約 1,700 萬客戶(約人口 67%),形成同業難以複製的規模與資料護城河(IBISWorld, 2025)。CBA 更於 Evident AI Index 2025 名列全球第 4、亞太第 1(Commonwealth Bank of Australia [CBA], 2025a)。本報告以「競爭護城河 vs 顛覆威脅」為主軸,論證在利差收窄與數位顛覆並存下,CBA 如何以 AI 深化護城河、回擊 Macquarie 與 fintech,使 AI 成為維繫定價權、迎向數位未來的關鍵槓桿。</w:t>
       </w:r>
     </w:p>
     <w:p>
       <w:pPr>
-        <w:spacing w:after="120" w:line="360" w:lineRule="auto"/>
+        <w:pStyle w:val="Heading1"/>
+        <w:spacing w:before="200" w:after="120" w:line="360" w:lineRule="auto"/>
       </w:pPr>
       <w:r>
         <w:rPr>
           <w:rFonts w:ascii="Times New Roman" w:hAnsi="Times New Roman" w:eastAsia="Microsoft JhengHei"/>
           <w:b/>
+          <w:color w:val="000000"/>
           <w:sz w:val="26"/>
         </w:rPr>
         <w:t>二、產業挑戰</w:t>
@@ -169,19 +211,22 @@
         <w:rPr>
           <w:rFonts w:ascii="Times New Roman" w:hAnsi="Times New Roman" w:eastAsia="Microsoft JhengHei"/>
           <w:b w:val="0"/>
+          <w:color w:val="000000"/>
           <w:sz w:val="24"/>
         </w:rPr>
-        <w:t>澳洲銀行業正承受多重結構性壓力,值得高階主管關注。第一,獲利與利差受壓:2025 年產業營收年減 8.3%,2025–30 年預測 CAGR 僅 +0.3%,產業已進入成熟期(IBISWorld, 2025);全球銀行淨利差亦預估由 2023 年 3.1% 降至 2030 年 2.7%(S&amp;P Global Market Intelligence, 2023),利差壓縮直接侵蝕四大行獲利。第二,數位顛覆與競爭加劇:開放銀行(CDR)降低客戶轉換成本,數位挑戰者持續蠶食;Macquarie 以純數位加經紀商模式高速搶市,2025 財年房貸帳冊年增約 19%,遠超產業(Australian Broker News, 2025)。第三,詐騙與資安威脅居高:2023 年澳洲通報詐騙損失仍達約 A$27 億(2024 年公布),監管與社會壓力促使銀行自行投入防詐(ACCC, 2024),在利差承壓之際再添成本。三項挑戰共同構成「獲利下滑、對手進逼、成本上升」的競爭脈絡,凸顯以科技轉型的急迫性。</w:t>
+        <w:t>澳洲銀行業正處結構性轉折,主要挑戰有三。第一,獲利與利差同步受壓:2025 年產業營收年減 8.3%、2025–30 年 CAGR 僅 +0.3%,利潤率五年降 1.1pp;全球銀行淨利息差(NIM)亦估自 3.1% 收窄至 2.7%,量價拉鋸使利差紅利縮水(IBISWorld, 2025; S&amp;P Global, 2023)。第二,數位顛覆白熱化:消費者資料權(CDR,開放銀行)降低轉換成本,Macquarie 房貸年增約 19%、市占升至 5.9%,非銀行與 fintech 放款方持續蠶食(Australian Broker News, 2025)。第三,詐騙與資安風險升溫:2023 年澳洲通報詐騙損失約 A$27 億,直接侵蝕客戶信任(Australian Competition and Consumer Commission, 2024)。三者交織,對定價權與客戶黏著度構成結構性壓力。</w:t>
       </w:r>
     </w:p>
     <w:p>
       <w:pPr>
-        <w:spacing w:after="120" w:line="360" w:lineRule="auto"/>
+        <w:pStyle w:val="Heading1"/>
+        <w:spacing w:before="200" w:after="120" w:line="360" w:lineRule="auto"/>
       </w:pPr>
       <w:r>
         <w:rPr>
           <w:rFonts w:ascii="Times New Roman" w:hAnsi="Times New Roman" w:eastAsia="Microsoft JhengHei"/>
           <w:b/>
+          <w:color w:val="000000"/>
           <w:sz w:val="26"/>
         </w:rPr>
         <w:t>三、公司當前表現</w:t>
@@ -195,19 +240,559 @@
         <w:rPr>
           <w:rFonts w:ascii="Times New Roman" w:hAnsi="Times New Roman" w:eastAsia="Microsoft JhengHei"/>
           <w:b w:val="0"/>
+          <w:color w:val="000000"/>
           <w:sz w:val="24"/>
         </w:rPr>
-        <w:t>以量化數據衡量,CBA 明顯跑贏產業並領先對手。在產業營收年減 8.3% 之際,CBA 2025 財年現金淨利(Cash NPAT)達 A$10,252m,年增 4.2%,展現逆勢韌性(Commonwealth Bank of Australia, 2025b)。獲利品質亦佳:淨利差(NIM)2.08%、股東權益報酬率(ROE)13.5%,高於 NAB 的 11.4% 與 ANZ 的 8.1%(FY25),為四大行最高(National Australia Bank, 2025; ANZ Group Holdings, 2025)。房貸為關鍵戰場:CBA 房貸結餘達 A$611.5bn(年增 6.5%),遠高於第二大的 Westpac A$498.5bn 與 NAB A$341.7bn,房貸市占 25.4%,為四大行之最(IBISWorld, 2025)。面對 Macquarie 的速度攻勢,CBA 以規模與品牌回應,2025 年首度成為澳洲最受信任銀行品牌(Roy Morgan Research, 2025)。綜合市占、獲利、房貸規模與信任度,CBA 競爭地位穩固。</w:t>
+        <w:t>面對上述壓力,CBA 仍顯著跑贏行業:FY25 現金淨利(Cash NPAT)達 A$10,252m(+4.2%),與產業營收衰退 8.3% 形成鮮明對照(CBA, 2025b)。其獲利品質與競爭地位領先同業——淨利息差 2.08%、ROE 13.5% 為四大行最高,房貸結餘 A$611.5bn、市占 25.4%(APRA 基礎)遙遙領先快速追趕的 Macquarie(詳見表一)。自有通路占比 66% 降低對經紀商的佣金依賴,廣大客群強化交叉銷售與資料優勢;CBA 更於 2025 年首度成為澳洲最受信任銀行品牌,鞏固信任護城河(Roy Morgan Research, 2025)。</w:t>
       </w:r>
     </w:p>
     <w:p>
       <w:pPr>
-        <w:spacing w:after="120" w:line="360" w:lineRule="auto"/>
+        <w:spacing w:after="80" w:line="360" w:lineRule="auto"/>
       </w:pPr>
       <w:r>
         <w:rPr>
           <w:rFonts w:ascii="Times New Roman" w:hAnsi="Times New Roman" w:eastAsia="Microsoft JhengHei"/>
           <w:b/>
+          <w:color w:val="000000"/>
+          <w:sz w:val="22"/>
+        </w:rPr>
+        <w:t>表一、四大行與 Macquarie 競爭指標對照(2025)</w:t>
+      </w:r>
+    </w:p>
+    <w:tbl>
+      <w:tblPr>
+        <w:tblStyle w:val="TableGrid"/>
+        <w:tblW w:type="auto" w:w="0"/>
+        <w:tblLook w:firstColumn="1" w:firstRow="1" w:lastColumn="0" w:lastRow="0" w:noHBand="0" w:noVBand="1" w:val="04A0"/>
+      </w:tblPr>
+      <w:tblGrid>
+        <w:gridCol w:w="1440"/>
+        <w:gridCol w:w="1440"/>
+        <w:gridCol w:w="1440"/>
+        <w:gridCol w:w="1440"/>
+        <w:gridCol w:w="1440"/>
+        <w:gridCol w:w="1440"/>
+      </w:tblGrid>
+      <w:tr>
+        <w:tc>
+          <w:tcPr>
+            <w:tcW w:type="dxa" w:w="1440"/>
+            <w:shd w:val="clear" w:fill="D9E2F3"/>
+          </w:tcPr>
+          <w:p>
+            <w:pPr>
+              <w:spacing w:line="264" w:lineRule="auto" w:after="20"/>
+            </w:pPr>
+            <w:r/>
+            <w:r>
+              <w:rPr>
+                <w:rFonts w:ascii="Times New Roman" w:hAnsi="Times New Roman" w:eastAsia="Microsoft JhengHei"/>
+                <w:b/>
+                <w:color w:val="000000"/>
+                <w:sz w:val="19"/>
+              </w:rPr>
+              <w:t>指標</w:t>
+            </w:r>
+          </w:p>
+        </w:tc>
+        <w:tc>
+          <w:tcPr>
+            <w:tcW w:type="dxa" w:w="1440"/>
+            <w:shd w:val="clear" w:fill="D9E2F3"/>
+          </w:tcPr>
+          <w:p>
+            <w:pPr>
+              <w:spacing w:line="264" w:lineRule="auto" w:after="20"/>
+            </w:pPr>
+            <w:r/>
+            <w:r>
+              <w:rPr>
+                <w:rFonts w:ascii="Times New Roman" w:hAnsi="Times New Roman" w:eastAsia="Microsoft JhengHei"/>
+                <w:b/>
+                <w:color w:val="000000"/>
+                <w:sz w:val="19"/>
+              </w:rPr>
+              <w:t>CBA</w:t>
+            </w:r>
+          </w:p>
+        </w:tc>
+        <w:tc>
+          <w:tcPr>
+            <w:tcW w:type="dxa" w:w="1440"/>
+            <w:shd w:val="clear" w:fill="D9E2F3"/>
+          </w:tcPr>
+          <w:p>
+            <w:pPr>
+              <w:spacing w:line="264" w:lineRule="auto" w:after="20"/>
+            </w:pPr>
+            <w:r/>
+            <w:r>
+              <w:rPr>
+                <w:rFonts w:ascii="Times New Roman" w:hAnsi="Times New Roman" w:eastAsia="Microsoft JhengHei"/>
+                <w:b/>
+                <w:color w:val="000000"/>
+                <w:sz w:val="19"/>
+              </w:rPr>
+              <w:t>NAB</w:t>
+            </w:r>
+          </w:p>
+        </w:tc>
+        <w:tc>
+          <w:tcPr>
+            <w:tcW w:type="dxa" w:w="1440"/>
+            <w:shd w:val="clear" w:fill="D9E2F3"/>
+          </w:tcPr>
+          <w:p>
+            <w:pPr>
+              <w:spacing w:line="264" w:lineRule="auto" w:after="20"/>
+            </w:pPr>
+            <w:r/>
+            <w:r>
+              <w:rPr>
+                <w:rFonts w:ascii="Times New Roman" w:hAnsi="Times New Roman" w:eastAsia="Microsoft JhengHei"/>
+                <w:b/>
+                <w:color w:val="000000"/>
+                <w:sz w:val="19"/>
+              </w:rPr>
+              <w:t>ANZ</w:t>
+            </w:r>
+          </w:p>
+        </w:tc>
+        <w:tc>
+          <w:tcPr>
+            <w:tcW w:type="dxa" w:w="1440"/>
+            <w:shd w:val="clear" w:fill="D9E2F3"/>
+          </w:tcPr>
+          <w:p>
+            <w:pPr>
+              <w:spacing w:line="264" w:lineRule="auto" w:after="20"/>
+            </w:pPr>
+            <w:r/>
+            <w:r>
+              <w:rPr>
+                <w:rFonts w:ascii="Times New Roman" w:hAnsi="Times New Roman" w:eastAsia="Microsoft JhengHei"/>
+                <w:b/>
+                <w:color w:val="000000"/>
+                <w:sz w:val="19"/>
+              </w:rPr>
+              <w:t>Westpac</w:t>
+            </w:r>
+          </w:p>
+        </w:tc>
+        <w:tc>
+          <w:tcPr>
+            <w:tcW w:type="dxa" w:w="1440"/>
+            <w:shd w:val="clear" w:fill="D9E2F3"/>
+          </w:tcPr>
+          <w:p>
+            <w:pPr>
+              <w:spacing w:line="264" w:lineRule="auto" w:after="20"/>
+            </w:pPr>
+            <w:r/>
+            <w:r>
+              <w:rPr>
+                <w:rFonts w:ascii="Times New Roman" w:hAnsi="Times New Roman" w:eastAsia="Microsoft JhengHei"/>
+                <w:b/>
+                <w:color w:val="000000"/>
+                <w:sz w:val="19"/>
+              </w:rPr>
+              <w:t>Macquarie</w:t>
+            </w:r>
+          </w:p>
+        </w:tc>
+      </w:tr>
+      <w:tr>
+        <w:tc>
+          <w:tcPr>
+            <w:tcW w:type="dxa" w:w="1440"/>
+          </w:tcPr>
+          <w:p>
+            <w:pPr>
+              <w:spacing w:line="264" w:lineRule="auto" w:after="20"/>
+            </w:pPr>
+            <w:r/>
+            <w:r>
+              <w:rPr>
+                <w:rFonts w:ascii="Times New Roman" w:hAnsi="Times New Roman" w:eastAsia="Microsoft JhengHei"/>
+                <w:b w:val="0"/>
+                <w:color w:val="000000"/>
+                <w:sz w:val="19"/>
+              </w:rPr>
+              <w:t>產業市占</w:t>
+            </w:r>
+          </w:p>
+        </w:tc>
+        <w:tc>
+          <w:tcPr>
+            <w:tcW w:type="dxa" w:w="1440"/>
+          </w:tcPr>
+          <w:p>
+            <w:pPr>
+              <w:spacing w:line="264" w:lineRule="auto" w:after="20"/>
+            </w:pPr>
+            <w:r/>
+            <w:r>
+              <w:rPr>
+                <w:rFonts w:ascii="Times New Roman" w:hAnsi="Times New Roman" w:eastAsia="Microsoft JhengHei"/>
+                <w:b w:val="0"/>
+                <w:color w:val="000000"/>
+                <w:sz w:val="19"/>
+              </w:rPr>
+              <w:t>21.7%</w:t>
+            </w:r>
+          </w:p>
+        </w:tc>
+        <w:tc>
+          <w:tcPr>
+            <w:tcW w:type="dxa" w:w="1440"/>
+          </w:tcPr>
+          <w:p>
+            <w:pPr>
+              <w:spacing w:line="264" w:lineRule="auto" w:after="20"/>
+            </w:pPr>
+            <w:r/>
+            <w:r>
+              <w:rPr>
+                <w:rFonts w:ascii="Times New Roman" w:hAnsi="Times New Roman" w:eastAsia="Microsoft JhengHei"/>
+                <w:b w:val="0"/>
+                <w:color w:val="000000"/>
+                <w:sz w:val="19"/>
+              </w:rPr>
+              <w:t>18.3%</w:t>
+            </w:r>
+          </w:p>
+        </w:tc>
+        <w:tc>
+          <w:tcPr>
+            <w:tcW w:type="dxa" w:w="1440"/>
+          </w:tcPr>
+          <w:p>
+            <w:pPr>
+              <w:spacing w:line="264" w:lineRule="auto" w:after="20"/>
+            </w:pPr>
+            <w:r/>
+            <w:r>
+              <w:rPr>
+                <w:rFonts w:ascii="Times New Roman" w:hAnsi="Times New Roman" w:eastAsia="Microsoft JhengHei"/>
+                <w:b w:val="0"/>
+                <w:color w:val="000000"/>
+                <w:sz w:val="19"/>
+              </w:rPr>
+              <w:t>17.5%</w:t>
+            </w:r>
+          </w:p>
+        </w:tc>
+        <w:tc>
+          <w:tcPr>
+            <w:tcW w:type="dxa" w:w="1440"/>
+          </w:tcPr>
+          <w:p>
+            <w:pPr>
+              <w:spacing w:line="264" w:lineRule="auto" w:after="20"/>
+            </w:pPr>
+            <w:r/>
+            <w:r>
+              <w:rPr>
+                <w:rFonts w:ascii="Times New Roman" w:hAnsi="Times New Roman" w:eastAsia="Microsoft JhengHei"/>
+                <w:b w:val="0"/>
+                <w:color w:val="000000"/>
+                <w:sz w:val="19"/>
+              </w:rPr>
+              <w:t>18.2%</w:t>
+            </w:r>
+          </w:p>
+        </w:tc>
+        <w:tc>
+          <w:tcPr>
+            <w:tcW w:type="dxa" w:w="1440"/>
+          </w:tcPr>
+          <w:p>
+            <w:pPr>
+              <w:spacing w:line="264" w:lineRule="auto" w:after="20"/>
+            </w:pPr>
+            <w:r/>
+            <w:r>
+              <w:rPr>
+                <w:rFonts w:ascii="Times New Roman" w:hAnsi="Times New Roman" w:eastAsia="Microsoft JhengHei"/>
+                <w:b w:val="0"/>
+                <w:color w:val="000000"/>
+                <w:sz w:val="19"/>
+              </w:rPr>
+              <w:t>—</w:t>
+            </w:r>
+          </w:p>
+        </w:tc>
+      </w:tr>
+      <w:tr>
+        <w:tc>
+          <w:tcPr>
+            <w:tcW w:type="dxa" w:w="1440"/>
+          </w:tcPr>
+          <w:p>
+            <w:pPr>
+              <w:spacing w:line="264" w:lineRule="auto" w:after="20"/>
+            </w:pPr>
+            <w:r/>
+            <w:r>
+              <w:rPr>
+                <w:rFonts w:ascii="Times New Roman" w:hAnsi="Times New Roman" w:eastAsia="Microsoft JhengHei"/>
+                <w:b w:val="0"/>
+                <w:color w:val="000000"/>
+                <w:sz w:val="19"/>
+              </w:rPr>
+              <w:t>ROE(FY25)</w:t>
+            </w:r>
+          </w:p>
+        </w:tc>
+        <w:tc>
+          <w:tcPr>
+            <w:tcW w:type="dxa" w:w="1440"/>
+          </w:tcPr>
+          <w:p>
+            <w:pPr>
+              <w:spacing w:line="264" w:lineRule="auto" w:after="20"/>
+            </w:pPr>
+            <w:r/>
+            <w:r>
+              <w:rPr>
+                <w:rFonts w:ascii="Times New Roman" w:hAnsi="Times New Roman" w:eastAsia="Microsoft JhengHei"/>
+                <w:b w:val="0"/>
+                <w:color w:val="000000"/>
+                <w:sz w:val="19"/>
+              </w:rPr>
+              <w:t>13.5%</w:t>
+            </w:r>
+          </w:p>
+        </w:tc>
+        <w:tc>
+          <w:tcPr>
+            <w:tcW w:type="dxa" w:w="1440"/>
+          </w:tcPr>
+          <w:p>
+            <w:pPr>
+              <w:spacing w:line="264" w:lineRule="auto" w:after="20"/>
+            </w:pPr>
+            <w:r/>
+            <w:r>
+              <w:rPr>
+                <w:rFonts w:ascii="Times New Roman" w:hAnsi="Times New Roman" w:eastAsia="Microsoft JhengHei"/>
+                <w:b w:val="0"/>
+                <w:color w:val="000000"/>
+                <w:sz w:val="19"/>
+              </w:rPr>
+              <w:t>11.4%</w:t>
+            </w:r>
+          </w:p>
+        </w:tc>
+        <w:tc>
+          <w:tcPr>
+            <w:tcW w:type="dxa" w:w="1440"/>
+          </w:tcPr>
+          <w:p>
+            <w:pPr>
+              <w:spacing w:line="264" w:lineRule="auto" w:after="20"/>
+            </w:pPr>
+            <w:r/>
+            <w:r>
+              <w:rPr>
+                <w:rFonts w:ascii="Times New Roman" w:hAnsi="Times New Roman" w:eastAsia="Microsoft JhengHei"/>
+                <w:b w:val="0"/>
+                <w:color w:val="000000"/>
+                <w:sz w:val="19"/>
+              </w:rPr>
+              <w:t>8.1%</w:t>
+            </w:r>
+          </w:p>
+        </w:tc>
+        <w:tc>
+          <w:tcPr>
+            <w:tcW w:type="dxa" w:w="1440"/>
+          </w:tcPr>
+          <w:p>
+            <w:pPr>
+              <w:spacing w:line="264" w:lineRule="auto" w:after="20"/>
+            </w:pPr>
+            <w:r/>
+            <w:r>
+              <w:rPr>
+                <w:rFonts w:ascii="Times New Roman" w:hAnsi="Times New Roman" w:eastAsia="Microsoft JhengHei"/>
+                <w:b w:val="0"/>
+                <w:color w:val="000000"/>
+                <w:sz w:val="19"/>
+              </w:rPr>
+              <w:t>n/a</w:t>
+            </w:r>
+          </w:p>
+        </w:tc>
+        <w:tc>
+          <w:tcPr>
+            <w:tcW w:type="dxa" w:w="1440"/>
+          </w:tcPr>
+          <w:p>
+            <w:pPr>
+              <w:spacing w:line="264" w:lineRule="auto" w:after="20"/>
+            </w:pPr>
+            <w:r/>
+            <w:r>
+              <w:rPr>
+                <w:rFonts w:ascii="Times New Roman" w:hAnsi="Times New Roman" w:eastAsia="Microsoft JhengHei"/>
+                <w:b w:val="0"/>
+                <w:color w:val="000000"/>
+                <w:sz w:val="19"/>
+              </w:rPr>
+              <w:t>—</w:t>
+            </w:r>
+          </w:p>
+        </w:tc>
+      </w:tr>
+      <w:tr>
+        <w:tc>
+          <w:tcPr>
+            <w:tcW w:type="dxa" w:w="1440"/>
+          </w:tcPr>
+          <w:p>
+            <w:pPr>
+              <w:spacing w:line="264" w:lineRule="auto" w:after="20"/>
+            </w:pPr>
+            <w:r/>
+            <w:r>
+              <w:rPr>
+                <w:rFonts w:ascii="Times New Roman" w:hAnsi="Times New Roman" w:eastAsia="Microsoft JhengHei"/>
+                <w:b w:val="0"/>
+                <w:color w:val="000000"/>
+                <w:sz w:val="19"/>
+              </w:rPr>
+              <w:t>房貸結餘(2025)</w:t>
+            </w:r>
+          </w:p>
+        </w:tc>
+        <w:tc>
+          <w:tcPr>
+            <w:tcW w:type="dxa" w:w="1440"/>
+          </w:tcPr>
+          <w:p>
+            <w:pPr>
+              <w:spacing w:line="264" w:lineRule="auto" w:after="20"/>
+            </w:pPr>
+            <w:r/>
+            <w:r>
+              <w:rPr>
+                <w:rFonts w:ascii="Times New Roman" w:hAnsi="Times New Roman" w:eastAsia="Microsoft JhengHei"/>
+                <w:b w:val="0"/>
+                <w:color w:val="000000"/>
+                <w:sz w:val="19"/>
+              </w:rPr>
+              <w:t>A$611.5bn</w:t>
+            </w:r>
+          </w:p>
+        </w:tc>
+        <w:tc>
+          <w:tcPr>
+            <w:tcW w:type="dxa" w:w="1440"/>
+          </w:tcPr>
+          <w:p>
+            <w:pPr>
+              <w:spacing w:line="264" w:lineRule="auto" w:after="20"/>
+            </w:pPr>
+            <w:r/>
+            <w:r>
+              <w:rPr>
+                <w:rFonts w:ascii="Times New Roman" w:hAnsi="Times New Roman" w:eastAsia="Microsoft JhengHei"/>
+                <w:b w:val="0"/>
+                <w:color w:val="000000"/>
+                <w:sz w:val="19"/>
+              </w:rPr>
+              <w:t>A$341.7bn</w:t>
+            </w:r>
+          </w:p>
+        </w:tc>
+        <w:tc>
+          <w:tcPr>
+            <w:tcW w:type="dxa" w:w="1440"/>
+          </w:tcPr>
+          <w:p>
+            <w:pPr>
+              <w:spacing w:line="264" w:lineRule="auto" w:after="20"/>
+            </w:pPr>
+            <w:r/>
+            <w:r>
+              <w:rPr>
+                <w:rFonts w:ascii="Times New Roman" w:hAnsi="Times New Roman" w:eastAsia="Microsoft JhengHei"/>
+                <w:b w:val="0"/>
+                <w:color w:val="000000"/>
+                <w:sz w:val="19"/>
+              </w:rPr>
+              <w:t>A$321.5bn</w:t>
+            </w:r>
+          </w:p>
+        </w:tc>
+        <w:tc>
+          <w:tcPr>
+            <w:tcW w:type="dxa" w:w="1440"/>
+          </w:tcPr>
+          <w:p>
+            <w:pPr>
+              <w:spacing w:line="264" w:lineRule="auto" w:after="20"/>
+            </w:pPr>
+            <w:r/>
+            <w:r>
+              <w:rPr>
+                <w:rFonts w:ascii="Times New Roman" w:hAnsi="Times New Roman" w:eastAsia="Microsoft JhengHei"/>
+                <w:b w:val="0"/>
+                <w:color w:val="000000"/>
+                <w:sz w:val="19"/>
+              </w:rPr>
+              <w:t>A$498.5bn</w:t>
+            </w:r>
+          </w:p>
+        </w:tc>
+        <w:tc>
+          <w:tcPr>
+            <w:tcW w:type="dxa" w:w="1440"/>
+          </w:tcPr>
+          <w:p>
+            <w:pPr>
+              <w:spacing w:line="264" w:lineRule="auto" w:after="20"/>
+            </w:pPr>
+            <w:r/>
+            <w:r>
+              <w:rPr>
+                <w:rFonts w:ascii="Times New Roman" w:hAnsi="Times New Roman" w:eastAsia="Microsoft JhengHei"/>
+                <w:b w:val="0"/>
+                <w:color w:val="000000"/>
+                <w:sz w:val="19"/>
+              </w:rPr>
+              <w:t>A$141.7bn</w:t>
+            </w:r>
+          </w:p>
+        </w:tc>
+      </w:tr>
+    </w:tbl>
+    <w:p>
+      <w:pPr>
+        <w:spacing w:after="160" w:line="288" w:lineRule="auto"/>
+      </w:pPr>
+      <w:r>
+        <w:rPr>
+          <w:rFonts w:ascii="Times New Roman" w:hAnsi="Times New Roman" w:eastAsia="Microsoft JhengHei"/>
+          <w:b w:val="0"/>
+          <w:color w:val="000000"/>
+          <w:sz w:val="17"/>
+        </w:rPr>
+        <w:t>資料來源:IBISWorld (2025);National Australia Bank (2025);ANZ Group Holdings (2025);Commonwealth Bank of Australia (2025b);Australian Broker News (2025)。Westpac FY25 ROE 未公開可比數字。</w:t>
+      </w:r>
+    </w:p>
+    <w:p>
+      <w:pPr>
+        <w:pStyle w:val="Heading1"/>
+        <w:spacing w:before="200" w:after="120" w:line="360" w:lineRule="auto"/>
+      </w:pPr>
+      <w:r>
+        <w:rPr>
+          <w:rFonts w:ascii="Times New Roman" w:hAnsi="Times New Roman" w:eastAsia="Microsoft JhengHei"/>
+          <w:b/>
+          <w:color w:val="000000"/>
           <w:sz w:val="26"/>
         </w:rPr>
         <w:t>四、AI 賦能</w:t>
@@ -221,22 +806,24 @@
         <w:rPr>
           <w:rFonts w:ascii="Times New Roman" w:hAnsi="Times New Roman" w:eastAsia="Microsoft JhengHei"/>
           <w:b w:val="0"/>
+          <w:color w:val="000000"/>
           <w:sz w:val="24"/>
         </w:rPr>
-        <w:t>CBA 的 AI 能力可逐一對應前述挑戰,並以四項標準評估:降本、體驗、速度與風險降幅。針對獲利與利差,AI 降本並改善體驗:Customer Engagement Engine 以機器學習即時驅動個人化互動,生成式 AI 應用程式訊息使客服等待時間於一個財年內下降約 40%,以效率抵禦利差壓縮(Commonwealth Bank of Australia, 2024)。針對數位顛覆與競爭,AI 加速信貸:房貸有條件核准可於 10 分鐘內完成,業務年度信貸審查由約 14 小時縮至 2 小時,以速度直接回應 Macquarie 的挑戰(Commonwealth Bank of Australia, 2024)。針對詐騙與資安,NameCheck 等 AI 防詐工具使客戶詐騙損失自 2022 年底高峰下降約 76%,FY25 投入約 9 億澳元強化防詐與資安,以風險降幅守住信任(Commonwealth Bank of Australia, 2025c)。三類 AI 能力精準對應三大挑戰,佐證 AI 已是 CBA 面向數位未來的核心引擎。</w:t>
+        <w:t>面對三大挑戰,CBA 以三項可衡量標準評估 AI 成效——效率、速度與風險,分別對應獲利、競爭與風險,各設成功門檻(見表二)。第一,效率軸回應利差受壓:Customer Engagement Engine 即時個人化搭配生成式 AI 客服,使客服等待時間顯著縮短,深化交叉銷售以攤平固定成本(CBA, 2024)。第二,速度軸回擊 Macquarie 與 fintech:AI 加速信貸審批,業務信貸年審已自 14 小時降至 2 小時,以速度築起顛覆者難以跨越的護城河(CBA, 2024)。第三,風險軸管理詐騙與資安:NameCheck 等防詐工具使客戶詐騙損失較 2022 年底高峰下降 76%,並持續加碼投入(CBA, 2025c)。就資源配置而言,筆者認為風險軸即時報酬最高、效率軸為長期護城河之本;展望未來,管理層宜將領先的 AI 地位轉化為可量化的成本收入比改善,持續鞏固結構性護城河;唯須同步強化資料治理與模型風險管理,方能將技術優勢穩健轉化為可持續的長期競爭力。</w:t>
       </w:r>
     </w:p>
     <w:p>
       <w:pPr>
-        <w:spacing w:after="120" w:line="360" w:lineRule="auto"/>
+        <w:spacing w:after="80" w:line="360" w:lineRule="auto"/>
       </w:pPr>
       <w:r>
         <w:rPr>
           <w:rFonts w:ascii="Times New Roman" w:hAnsi="Times New Roman" w:eastAsia="Microsoft JhengHei"/>
           <w:b/>
-          <w:sz w:val="24"/>
+          <w:color w:val="000000"/>
+          <w:sz w:val="22"/>
         </w:rPr>
-        <w:t>挑戰 → AI 能力 → 預期效益(對應表)</w:t>
+        <w:t>表二、挑戰 → AI 能力 → 效益對照</w:t>
       </w:r>
     </w:p>
     <w:tbl>
@@ -258,14 +845,15 @@
           </w:tcPr>
           <w:p>
             <w:pPr>
-              <w:spacing w:line="276" w:lineRule="auto" w:after="40"/>
+              <w:spacing w:line="264" w:lineRule="auto" w:after="20"/>
             </w:pPr>
             <w:r/>
             <w:r>
               <w:rPr>
                 <w:rFonts w:ascii="Times New Roman" w:hAnsi="Times New Roman" w:eastAsia="Microsoft JhengHei"/>
                 <w:b/>
-                <w:sz w:val="21"/>
+                <w:color w:val="000000"/>
+                <w:sz w:val="19"/>
               </w:rPr>
               <w:t>產業挑戰</w:t>
             </w:r>
@@ -278,16 +866,17 @@
           </w:tcPr>
           <w:p>
             <w:pPr>
-              <w:spacing w:line="276" w:lineRule="auto" w:after="40"/>
+              <w:spacing w:line="264" w:lineRule="auto" w:after="20"/>
             </w:pPr>
             <w:r/>
             <w:r>
               <w:rPr>
                 <w:rFonts w:ascii="Times New Roman" w:hAnsi="Times New Roman" w:eastAsia="Microsoft JhengHei"/>
                 <w:b/>
-                <w:sz w:val="21"/>
+                <w:color w:val="000000"/>
+                <w:sz w:val="19"/>
               </w:rPr>
-              <w:t>CBA 對應 AI 能力</w:t>
+              <w:t>對應 AI 能力(評估軸與門檻)</w:t>
             </w:r>
           </w:p>
         </w:tc>
@@ -298,16 +887,17 @@
           </w:tcPr>
           <w:p>
             <w:pPr>
-              <w:spacing w:line="276" w:lineRule="auto" w:after="40"/>
+              <w:spacing w:line="264" w:lineRule="auto" w:after="20"/>
             </w:pPr>
             <w:r/>
             <w:r>
               <w:rPr>
                 <w:rFonts w:ascii="Times New Roman" w:hAnsi="Times New Roman" w:eastAsia="Microsoft JhengHei"/>
                 <w:b/>
-                <w:sz w:val="21"/>
+                <w:color w:val="000000"/>
+                <w:sz w:val="19"/>
               </w:rPr>
-              <w:t>評估標準與量化效益</w:t>
+              <w:t>量化效益</w:t>
             </w:r>
           </w:p>
         </w:tc>
@@ -319,16 +909,17 @@
           </w:tcPr>
           <w:p>
             <w:pPr>
-              <w:spacing w:line="276" w:lineRule="auto" w:after="40"/>
+              <w:spacing w:line="264" w:lineRule="auto" w:after="20"/>
             </w:pPr>
             <w:r/>
             <w:r>
               <w:rPr>
                 <w:rFonts w:ascii="Times New Roman" w:hAnsi="Times New Roman" w:eastAsia="Microsoft JhengHei"/>
                 <w:b w:val="0"/>
-                <w:sz w:val="21"/>
+                <w:color w:val="000000"/>
+                <w:sz w:val="19"/>
               </w:rPr>
-              <w:t>獲利受壓、利差壓縮</w:t>
+              <w:t>獲利與利差受壓</w:t>
             </w:r>
           </w:p>
         </w:tc>
@@ -338,16 +929,17 @@
           </w:tcPr>
           <w:p>
             <w:pPr>
-              <w:spacing w:line="276" w:lineRule="auto" w:after="40"/>
+              <w:spacing w:line="264" w:lineRule="auto" w:after="20"/>
             </w:pPr>
             <w:r/>
             <w:r>
               <w:rPr>
                 <w:rFonts w:ascii="Times New Roman" w:hAnsi="Times New Roman" w:eastAsia="Microsoft JhengHei"/>
                 <w:b w:val="0"/>
-                <w:sz w:val="21"/>
+                <w:color w:val="000000"/>
+                <w:sz w:val="19"/>
               </w:rPr>
-              <w:t>CEE 個人化互動、生成式 AI 客服助理</w:t>
+              <w:t>效率軸:CEE 與生成式 AI 客服(門檻:成本收入比下行、等待縮短)</w:t>
             </w:r>
           </w:p>
         </w:tc>
@@ -357,16 +949,17 @@
           </w:tcPr>
           <w:p>
             <w:pPr>
-              <w:spacing w:line="276" w:lineRule="auto" w:after="40"/>
+              <w:spacing w:line="264" w:lineRule="auto" w:after="20"/>
             </w:pPr>
             <w:r/>
             <w:r>
               <w:rPr>
                 <w:rFonts w:ascii="Times New Roman" w:hAnsi="Times New Roman" w:eastAsia="Microsoft JhengHei"/>
                 <w:b w:val="0"/>
-                <w:sz w:val="21"/>
+                <w:color w:val="000000"/>
+                <w:sz w:val="19"/>
               </w:rPr>
-              <w:t>降本／體驗:客服等待時間 -40%</w:t>
+              <w:t>客服等待時間一財年內 -40%;深化交叉銷售</w:t>
             </w:r>
           </w:p>
         </w:tc>
@@ -378,16 +971,17 @@
           </w:tcPr>
           <w:p>
             <w:pPr>
-              <w:spacing w:line="276" w:lineRule="auto" w:after="40"/>
+              <w:spacing w:line="264" w:lineRule="auto" w:after="20"/>
             </w:pPr>
             <w:r/>
             <w:r>
               <w:rPr>
                 <w:rFonts w:ascii="Times New Roman" w:hAnsi="Times New Roman" w:eastAsia="Microsoft JhengHei"/>
                 <w:b w:val="0"/>
-                <w:sz w:val="21"/>
+                <w:color w:val="000000"/>
+                <w:sz w:val="19"/>
               </w:rPr>
-              <w:t>數位顛覆、對手搶市(Macquarie)</w:t>
+              <w:t>數位顛覆與競爭(Macquarie +19%、CDR)</w:t>
             </w:r>
           </w:p>
         </w:tc>
@@ -397,16 +991,17 @@
           </w:tcPr>
           <w:p>
             <w:pPr>
-              <w:spacing w:line="276" w:lineRule="auto" w:after="40"/>
+              <w:spacing w:line="264" w:lineRule="auto" w:after="20"/>
             </w:pPr>
             <w:r/>
             <w:r>
               <w:rPr>
                 <w:rFonts w:ascii="Times New Roman" w:hAnsi="Times New Roman" w:eastAsia="Microsoft JhengHei"/>
                 <w:b w:val="0"/>
-                <w:sz w:val="21"/>
+                <w:color w:val="000000"/>
+                <w:sz w:val="19"/>
               </w:rPr>
-              <w:t>AI 加速信貸與流程自動化</w:t>
+              <w:t>速度軸:AI 加速信貸審批(門檻:核准 &lt;10 分鐘／年審 &lt;2 小時)</w:t>
             </w:r>
           </w:p>
         </w:tc>
@@ -416,16 +1011,17 @@
           </w:tcPr>
           <w:p>
             <w:pPr>
-              <w:spacing w:line="276" w:lineRule="auto" w:after="40"/>
+              <w:spacing w:line="264" w:lineRule="auto" w:after="20"/>
             </w:pPr>
             <w:r/>
             <w:r>
               <w:rPr>
                 <w:rFonts w:ascii="Times New Roman" w:hAnsi="Times New Roman" w:eastAsia="Microsoft JhengHei"/>
                 <w:b w:val="0"/>
-                <w:sz w:val="21"/>
+                <w:color w:val="000000"/>
+                <w:sz w:val="19"/>
               </w:rPr>
-              <w:t>速度:房貸核准低於 10 分鐘;信貸審查 14 小時 → 2 小時</w:t>
+              <w:t>房貸有條件核准 &lt;10 分鐘;業務信貸年審 14 小時 → 2 小時</w:t>
             </w:r>
           </w:p>
         </w:tc>
@@ -437,16 +1033,17 @@
           </w:tcPr>
           <w:p>
             <w:pPr>
-              <w:spacing w:line="276" w:lineRule="auto" w:after="40"/>
+              <w:spacing w:line="264" w:lineRule="auto" w:after="20"/>
             </w:pPr>
             <w:r/>
             <w:r>
               <w:rPr>
                 <w:rFonts w:ascii="Times New Roman" w:hAnsi="Times New Roman" w:eastAsia="Microsoft JhengHei"/>
                 <w:b w:val="0"/>
-                <w:sz w:val="21"/>
+                <w:color w:val="000000"/>
+                <w:sz w:val="19"/>
               </w:rPr>
-              <w:t>詐騙、詐欺與資安威脅</w:t>
+              <w:t>詐騙與資安風險</w:t>
             </w:r>
           </w:p>
         </w:tc>
@@ -456,16 +1053,17 @@
           </w:tcPr>
           <w:p>
             <w:pPr>
-              <w:spacing w:line="276" w:lineRule="auto" w:after="40"/>
+              <w:spacing w:line="264" w:lineRule="auto" w:after="20"/>
             </w:pPr>
             <w:r/>
             <w:r>
               <w:rPr>
                 <w:rFonts w:ascii="Times New Roman" w:hAnsi="Times New Roman" w:eastAsia="Microsoft JhengHei"/>
                 <w:b w:val="0"/>
-                <w:sz w:val="21"/>
+                <w:color w:val="000000"/>
+                <w:sz w:val="19"/>
               </w:rPr>
-              <w:t>NameCheck、CallerCheck 等 AI 防詐</w:t>
+              <w:t>風險軸:NameCheck 等防詐 AI(門檻:損失較高峰大幅下降)</w:t>
             </w:r>
           </w:p>
         </w:tc>
@@ -475,16 +1073,17 @@
           </w:tcPr>
           <w:p>
             <w:pPr>
-              <w:spacing w:line="276" w:lineRule="auto" w:after="40"/>
+              <w:spacing w:line="264" w:lineRule="auto" w:after="20"/>
             </w:pPr>
             <w:r/>
             <w:r>
               <w:rPr>
                 <w:rFonts w:ascii="Times New Roman" w:hAnsi="Times New Roman" w:eastAsia="Microsoft JhengHei"/>
                 <w:b w:val="0"/>
-                <w:sz w:val="21"/>
+                <w:color w:val="000000"/>
+                <w:sz w:val="19"/>
               </w:rPr>
-              <w:t>風險降幅:詐騙損失 -76%;FY25 防詐投入約 A$9 億</w:t>
+              <w:t>客戶詐騙損失自 2022 年底高峰 -76%;FY25 投入約 A$9 億</w:t>
             </w:r>
           </w:p>
         </w:tc>
@@ -497,12 +1096,14 @@
     </w:p>
     <w:p>
       <w:pPr>
-        <w:spacing w:after="160" w:line="360" w:lineRule="auto"/>
+        <w:pStyle w:val="Heading1"/>
+        <w:spacing w:before="200" w:after="120" w:line="360" w:lineRule="auto"/>
       </w:pPr>
       <w:r>
         <w:rPr>
           <w:rFonts w:ascii="Times New Roman" w:hAnsi="Times New Roman" w:eastAsia="Microsoft JhengHei"/>
           <w:b/>
+          <w:color w:val="000000"/>
           <w:sz w:val="26"/>
         </w:rPr>
         <w:t>參考文獻</w:t>
@@ -517,9 +1118,10 @@
         <w:rPr>
           <w:rFonts w:ascii="Times New Roman" w:hAnsi="Times New Roman" w:eastAsia="Microsoft JhengHei"/>
           <w:b w:val="0"/>
+          <w:color w:val="000000"/>
           <w:sz w:val="22"/>
         </w:rPr>
-        <w:t>ACCC. (2024). Scam losses decline, but more work to do as Australians lose $2.7 billion. National Anti-Scam Centre / Scamwatch. https://www.accc.gov.au/media-release/scam-losses-decline-but-more-work-to-do-as-australians-lose-27-billion</w:t>
+        <w:t>ANZ Group Holdings. (2025). 2025 full year result and proposed final dividend. https://www.anz.com.au/newsroom/media/2025/november/2025-full-year-result---proposed-final-dividend/</w:t>
       </w:r>
     </w:p>
     <w:p>
@@ -531,9 +1133,10 @@
         <w:rPr>
           <w:rFonts w:ascii="Times New Roman" w:hAnsi="Times New Roman" w:eastAsia="Microsoft JhengHei"/>
           <w:b w:val="0"/>
+          <w:color w:val="000000"/>
           <w:sz w:val="22"/>
         </w:rPr>
-        <w:t>ANZ Group Holdings. (2025). 2025 full year result &amp; proposed final dividend. https://www.anz.com.au/newsroom/media/2025/november/2025-full-year-result---proposed-final-dividend/</w:t>
+        <w:t>Australian Broker News. (2025). Macquarie Bank's home loan book surges 19%, defying industry trends. https://www.brokernews.com.au/</w:t>
       </w:r>
     </w:p>
     <w:p>
@@ -545,9 +1148,10 @@
         <w:rPr>
           <w:rFonts w:ascii="Times New Roman" w:hAnsi="Times New Roman" w:eastAsia="Microsoft JhengHei"/>
           <w:b w:val="0"/>
+          <w:color w:val="000000"/>
           <w:sz w:val="22"/>
         </w:rPr>
-        <w:t>Australian Broker News. (2025). Macquarie Bank's home loan book surges 19%, defying industry trends. https://www.brokernews.com.au/news/breaking-news/macquarie-banks-home-loan-book-surges-19-defying-industry-trends-287135.aspx</w:t>
+        <w:t>Australian Competition and Consumer Commission. (2024). Scam losses decline, but more work to do as Australians lose $2.7 billion. National Anti-Scam Centre. https://www.accc.gov.au/media-release/scam-losses-decline-but-more-work-to-do-as-australians-lose-27-billion</w:t>
       </w:r>
     </w:p>
     <w:p>
@@ -559,6 +1163,7 @@
         <w:rPr>
           <w:rFonts w:ascii="Times New Roman" w:hAnsi="Times New Roman" w:eastAsia="Microsoft JhengHei"/>
           <w:b w:val="0"/>
+          <w:color w:val="000000"/>
           <w:sz w:val="22"/>
         </w:rPr>
         <w:t>Commonwealth Bank of Australia. (2024). Customer safety, convenience and recognition boosted by early implementation of Gen AI. https://www.commbank.com.au/articles/newsroom/2024/11/reimagining-banking-nov24.html</w:t>
@@ -573,6 +1178,7 @@
         <w:rPr>
           <w:rFonts w:ascii="Times New Roman" w:hAnsi="Times New Roman" w:eastAsia="Microsoft JhengHei"/>
           <w:b w:val="0"/>
+          <w:color w:val="000000"/>
           <w:sz w:val="22"/>
         </w:rPr>
         <w:t>Commonwealth Bank of Australia. (2025a). CommBank ranks among world's best banks for AI maturity. https://www.commbank.com.au/articles/newsroom/2025/10/commbank-among-best-banks-ai-maturity1.html</w:t>
@@ -587,6 +1193,7 @@
         <w:rPr>
           <w:rFonts w:ascii="Times New Roman" w:hAnsi="Times New Roman" w:eastAsia="Microsoft JhengHei"/>
           <w:b w:val="0"/>
+          <w:color w:val="000000"/>
           <w:sz w:val="22"/>
         </w:rPr>
         <w:t>Commonwealth Bank of Australia. (2025b). FY25 full year results. Investor Relations. https://www.commbank.com.au/about-us/investors/results.html</w:t>
@@ -601,9 +1208,10 @@
         <w:rPr>
           <w:rFonts w:ascii="Times New Roman" w:hAnsi="Times New Roman" w:eastAsia="Microsoft JhengHei"/>
           <w:b w:val="0"/>
+          <w:color w:val="000000"/>
           <w:sz w:val="22"/>
         </w:rPr>
-        <w:t>Commonwealth Bank of Australia. (2025c). CBA sees customer scam losses fall by 76% and adds two new forms of armour to help keep customers safe. https://www.commbank.com.au/articles/newsroom/2025/08/commbank-customer-scam-losses-fall-truyu.html</w:t>
+        <w:t>Commonwealth Bank of Australia. (2025c). CBA sees customer scam losses fall by 76%. https://www.commbank.com.au/articles/newsroom/2025/08/commbank-customer-scam-losses-fall-truyu.html</w:t>
       </w:r>
     </w:p>
     <w:p>
@@ -615,9 +1223,10 @@
         <w:rPr>
           <w:rFonts w:ascii="Times New Roman" w:hAnsi="Times New Roman" w:eastAsia="Microsoft JhengHei"/>
           <w:b w:val="0"/>
+          <w:color w:val="000000"/>
           <w:sz w:val="22"/>
         </w:rPr>
-        <w:t>IBISWorld. (2025). K6221A national and regional commercial banks in Australia. IBISWorld Industry Report.</w:t>
+        <w:t>IBISWorld. (2025). National and regional commercial banks in Australia (Report No. K6221A). IBISWorld Industry Report.</w:t>
       </w:r>
     </w:p>
     <w:p>
@@ -629,9 +1238,10 @@
         <w:rPr>
           <w:rFonts w:ascii="Times New Roman" w:hAnsi="Times New Roman" w:eastAsia="Microsoft JhengHei"/>
           <w:b w:val="0"/>
+          <w:color w:val="000000"/>
           <w:sz w:val="22"/>
         </w:rPr>
-        <w:t>National Australia Bank. (2025). 2025 full year results investor presentation. https://www.nab.com.au/content/dam/nab/documents/reports/corporate/2025-full-year-results-investor-presentation.pdf</w:t>
+        <w:t>National Australia Bank. (2025). 2025 full year results investor presentation. https://www.nab.com.au/</w:t>
       </w:r>
     </w:p>
     <w:p>
@@ -643,9 +1253,10 @@
         <w:rPr>
           <w:rFonts w:ascii="Times New Roman" w:hAnsi="Times New Roman" w:eastAsia="Microsoft JhengHei"/>
           <w:b w:val="0"/>
+          <w:color w:val="000000"/>
           <w:sz w:val="22"/>
         </w:rPr>
-        <w:t>Roy Morgan Research. (2025). Commonwealth Bank are Australia's most trusted finance and insurance brands (Trusted Brand Awards 2025). https://www.roymorgan.com/findings/10038-trusted-brand-awards-2025-finance-and-insurance-companies</w:t>
+        <w:t>Roy Morgan Research. (2025). Commonwealth Bank are Australia's most trusted finance and insurance brands. https://www.roymorgan.com/findings/10038-trusted-brand-awards-2025-finance-and-insurance-companies</w:t>
       </w:r>
     </w:p>
     <w:p>
@@ -657,9 +1268,10 @@
         <w:rPr>
           <w:rFonts w:ascii="Times New Roman" w:hAnsi="Times New Roman" w:eastAsia="Microsoft JhengHei"/>
           <w:b w:val="0"/>
+          <w:color w:val="000000"/>
           <w:sz w:val="22"/>
         </w:rPr>
-        <w:t>S&amp;P Global Market Intelligence. (2023). Competition to squeeze Australian bank profits in 2024 as COVID-era subsidy ends. https://www.spglobal.com/market-intelligence/en/news-insights/articles/2023/12/competition-to-squeeze-australian-bank-profits-in-2024-as-covid-era-subsidy-ends-79741492</w:t>
+        <w:t>S&amp;P Global Market Intelligence. (2023). Competition to squeeze Australian bank profits in 2024 as COVID-era subsidy ends. https://www.spglobal.com/</w:t>
       </w:r>
     </w:p>
     <w:sectPr>

</xml_diff>

<commit_message>
Add UTS Library note + Davenport et al. (2019) citation to Assessment 1
Per lecturers' guidance in week-1 Zoom: show UTS Library usage (IBISWorld
now marked 'Retrieved via UTS Library') and cite one scholarly source from
the unit reading list (Davenport et al., 2019, JAMS) in the AI-enablement
section. Word count 749 Han / 863 Word-count, still within 800 +/-10%.

Co-Authored-By: Claude Fable 5 <noreply@anthropic.com>
</commit_message>
<xml_diff>
--- a/Artificial Intelligence for Enterprises/Assessment1/Huang_26254793_421104_Assessment1.docx
+++ b/Artificial Intelligence for Enterprises/Assessment1/Huang_26254793_421104_Assessment1.docx
@@ -122,7 +122,7 @@
           <w:color w:val="000000"/>
           <w:sz w:val="23"/>
         </w:rPr>
-        <w:t>正文字數:約 730 中文字／Word 字數約 839(不含標題頁、目錄、表格與參考文獻)</w:t>
+        <w:t>正文字數:約 749 中文字／Word 字數約 863(不含標題頁、目錄、表格與參考文獻)</w:t>
       </w:r>
     </w:p>
     <w:p>
@@ -809,7 +809,7 @@
           <w:color w:val="000000"/>
           <w:sz w:val="24"/>
         </w:rPr>
-        <w:t>面對三大挑戰,CBA 以三項可衡量標準評估 AI 成效——效率、速度與風險,分別對應獲利、競爭與風險,各設成功門檻(見表二)。第一,效率軸回應利差受壓:Customer Engagement Engine 即時個人化搭配生成式 AI 客服,使客服等待時間顯著縮短,深化交叉銷售以攤平固定成本(CBA, 2024)。第二,速度軸回擊 Macquarie 與 fintech:AI 加速信貸審批,業務信貸年審已自 14 小時降至 2 小時,以速度築起顛覆者難以跨越的護城河(CBA, 2024)。第三,風險軸管理詐騙與資安:NameCheck 等防詐工具使客戶詐騙損失較 2022 年底高峰下降 76%,並持續加碼投入(CBA, 2025c)。就資源配置而言,筆者認為風險軸即時報酬最高、效率軸為長期護城河之本;展望未來,管理層宜將領先的 AI 地位轉化為可量化的成本收入比改善,持續鞏固結構性護城河;唯須同步強化資料治理與模型風險管理,方能將技術優勢穩健轉化為可持續的長期競爭力。</w:t>
+        <w:t>面對三大挑戰,CBA 以三項可衡量標準評估 AI 成效——效率、速度與風險,分別對應獲利、競爭與風險,各設成功門檻(見表二)。第一,效率軸回應利差受壓:AI 被學界視為重塑行銷與顧客互動的核心力量(Davenport et al., 2019),Customer Engagement Engine 即時個人化搭配生成式 AI 客服,使客服等待時間顯著縮短,深化交叉銷售以攤平固定成本(CBA, 2024)。第二,速度軸回擊 Macquarie 與 fintech:AI 加速信貸審批,業務信貸年審已自 14 小時降至 2 小時,以速度築起顛覆者難以跨越的護城河(CBA, 2024)。第三,風險軸管理詐騙與資安:NameCheck 等防詐工具使客戶詐騙損失較 2022 年底高峰下降 76%,並持續加碼投入(CBA, 2025c)。就資源配置而言,筆者認為風險軸即時報酬最高、效率軸為長期護城河之本;展望未來,管理層宜將領先的 AI 地位轉化為可量化的成本收入比改善,持續鞏固結構性護城河;唯須同步強化資料治理與模型風險管理,方能將技術優勢穩健轉化為可持續的長期競爭力。</w:t>
       </w:r>
     </w:p>
     <w:p>
@@ -1226,7 +1226,22 @@
           <w:color w:val="000000"/>
           <w:sz w:val="22"/>
         </w:rPr>
-        <w:t>IBISWorld. (2025). National and regional commercial banks in Australia (Report No. K6221A). IBISWorld Industry Report.</w:t>
+        <w:t>Davenport, T., Guha, A., Grewal, D., &amp; Bressgott, T. (2019). How artificial intelligence will change the future of marketing. Journal of the Academy of Marketing Science, 48(1), 24-42. https://doi.org/10.1007/s11747-019-00696-0</w:t>
+      </w:r>
+    </w:p>
+    <w:p>
+      <w:pPr>
+        <w:spacing w:after="160" w:line="360" w:lineRule="auto"/>
+        <w:ind w:left="720" w:hanging="720"/>
+      </w:pPr>
+      <w:r>
+        <w:rPr>
+          <w:rFonts w:ascii="Times New Roman" w:hAnsi="Times New Roman" w:eastAsia="Microsoft JhengHei"/>
+          <w:b w:val="0"/>
+          <w:color w:val="000000"/>
+          <w:sz w:val="22"/>
+        </w:rPr>
+        <w:t>IBISWorld. (2025). National and regional commercial banks in Australia (Report No. K6221A). IBISWorld Industry Report. Retrieved via UTS Library.</w:t>
       </w:r>
     </w:p>
     <w:p>

</xml_diff>